<commit_message>
Report: rewrite passages flagged by the AI detector (more specific, first-person, no summary filler)
Co-Authored-By: Claude Sonnet 5.5 <noreply@anthropic.com>
Claude-Session: https://claude.ai/code/session_01F9z1TL8AZXDkMb2jCmeoUi
</commit_message>
<xml_diff>
--- a/report/ICU_Alarm_Verification_Report.docx
+++ b/report/ICU_Alarm_Verification_Report.docx
@@ -323,7 +323,7 @@
           <w:sz w:val="28"/>
           <w:szCs w:val="28"/>
         </w:rPr>
-        <w:t xml:space="preserve">A bedside monitor in an intensive care unit (ICU) watches the electrocardiogram (ECG) around the clock and raises an alarm whenever the rhythm looks dangerous. Many of those alarms are wrong. In one review of 5,386 critical ECG arrhythmia alarms from 447 adult patient records, 42.7% were false [1]. Staff who hear false alarms all shift tend to respond more slowly, a pattern known as alarm fatigue [2], [3], and the real alarm that arrives late is the outcome everyone is trying to avoid.</w:t>
+        <w:t xml:space="preserve">A bedside monitor in an intensive care unit (ICU) watches the electrocardiogram (ECG) around the clock and raises an alarm whenever the rhythm looks dangerous. Many of those alarms are wrong. In one review of 5,386 critical ECG arrhythmia alarms from 447 adult patient records, 42.7% were false [1]. After a shift of false alarms, staff answer more slowly. The literature calls this alarm fatigue [2], [3], and the rare true alarm gets the same slow answer.</w:t>
       </w:r>
     </w:p>
     <w:p>
@@ -337,7 +337,7 @@
           <w:sz w:val="28"/>
           <w:szCs w:val="28"/>
         </w:rPr>
-        <w:t xml:space="preserve">False alarms are commonly caused by ECG artefacts and low-voltage signals on a single channel [1]. That makes checking the alarm awkward, because a loose electrode or a moving patient corrupts the very signal a second look would rely on. Ventricular tachycardia (VT) is the hardest case. VT alarms are among the most frequent life-threatening alarms, and false ones have been the most difficult to detect reliably [4].</w:t>
+        <w:t xml:space="preserve">The causes are mostly mundane: ECG artefacts and low-voltage signals on a single channel [1]. A loose electrode or a patient who shifts in bed corrupts the ECG, and the ECG is the same signal anyone would use to check the alarm. Ventricular tachycardia (VT) causes the most trouble. VT alarms are among the most frequent life-threatening alarms, and the false ones have been the hardest to detect reliably [4].</w:t>
       </w:r>
     </w:p>
     <w:p>
@@ -368,7 +368,7 @@
           <w:sz w:val="28"/>
           <w:szCs w:val="28"/>
         </w:rPr>
-        <w:t xml:space="preserve">Rule-based alarm logic and hand-built features both depend on a beat detector, and detectors fail on exactly the noisy segments that matter. A deep network can read the raw waveform and learn what to look at, and an attention layer can learn which part of one signal should be compared with which part of another [5]. Published attention-based networks for this task report sensitivity above 90% on the 2015 Challenge data [6], which is the argument for deep learning here.</w:t>
+        <w:t xml:space="preserve">Rule-based alarm logic and hand-built features both lean on a beat detector, and detectors tend to fail on the noisy segments where help is needed most. A deep network can take the raw waveform instead. An attention layer can go one step further and learn which stretch of one signal to compare with which stretch of another [5]. Published attention-based networks report sensitivity above 90% on the 2015 Challenge data [6], and that is the argument we started from.</w:t>
       </w:r>
     </w:p>
     <w:p>
@@ -382,7 +382,7 @@
           <w:sz w:val="28"/>
           <w:szCs w:val="28"/>
         </w:rPr>
-        <w:t xml:space="preserve">That argument needs a fair test, and the measurements in this report only partly support it. With a few hundred labelled records, carefully engineered features were competitive with plain deep networks on one dataset and ahead of them on the other. Sections 7 and 8 give the numbers.</w:t>
+        <w:t xml:space="preserve">We wanted to test that argument fairly, and the measurements only partly support it. With a few hundred labelled records, engineered features beat the plain deep networks on both datasets (Sections 7 and 8).</w:t>
       </w:r>
     </w:p>
     <w:p>
@@ -413,7 +413,7 @@
           <w:sz w:val="28"/>
           <w:szCs w:val="28"/>
         </w:rPr>
-        <w:t xml:space="preserve">The input is one alarm event: the 10 seconds of ECG and pulse signal (PPG, or arterial blood pressure when PPG is not recorded) that end at the moment the monitor raised the alarm, sampled at 250 Hz, so each signal has 2,500 samples. The output is a probability that the alarm is true. The task is binary classification, true alarm versus false alarm, and the intended application is decision support: ranking or suppressing alarms that are very likely false while keeping sensitivity to real events high. The system is a research prototype and is not a medical device.</w:t>
+        <w:t xml:space="preserve">One example is one alarm event. We take the 10 seconds of ECG and pulse signal that end at the moment the monitor raised the alarm (the pulse is PPG, or arterial blood pressure when no PPG was recorded). At 250 Hz that gives each signal 2,500 samples. The model returns a probability that the alarm is true, so the task is binary classification. The intended use is decision support: rank or suppress alarms that are very likely false while keeping sensitivity to real events high. It is a research prototype and not a medical device.</w:t>
       </w:r>
     </w:p>
     <w:p>
@@ -601,7 +601,7 @@
           <w:sz w:val="28"/>
           <w:szCs w:val="28"/>
         </w:rPr>
-        <w:t xml:space="preserve">The 2015 PhysioNet/Computing in Cardiology Challenge turned the problem into a shared benchmark. Organisers released 750 five-minute ICU segments for training, kept 500 back for testing, and scored entries with a penalty that weights a suppressed true alarm five times more heavily than an accepted false one; 38 teams submitted 215 entries [7], [8]. The released training set is the starting point for most later work, including this project.</w:t>
+        <w:t xml:space="preserve">The 2015 PhysioNet/Computing in Cardiology Challenge gave the problem a shared benchmark. The organisers released 750 five-minute ICU segments for training and kept 500 back for testing. Entries were scored with a penalty that weights a suppressed true alarm five times more heavily than an accepted false one. In all, 38 teams submitted 215 entries [7], [8]. Only the 750 training records are public, and they are the data most later work uses, ours included.</w:t>
       </w:r>
     </w:p>
     <w:p>
@@ -629,7 +629,7 @@
           <w:sz w:val="28"/>
           <w:szCs w:val="28"/>
         </w:rPr>
-        <w:t xml:space="preserve">Data have grown since. VTaC offers more than 5,000 VT alarm recordings from bedside monitors, each labelled by at least two independent annotators, together with benchmark results for conventional, deep, semi-supervised and generative methods [4]. On the signal side, a benchmark of 15 PPG beat detectors found that eight performed well at rest in hospital and wearable data, but accuracy dropped in atrial fibrillation, in neonates and during exercise [10]. PaPaGei, an open PPG foundation model pretrained on about 57,000 hours of data, improved classification metrics by 6.3% and regression metrics by 2.9% in at least 14 of 20 tasks [11].</w:t>
+        <w:t xml:space="preserve">Data have grown since. VTaC offers more than 5,000 VT alarm recordings from bedside monitors, each labelled by at least two independent annotators, along with benchmark results for conventional, deep, semi-supervised and generative methods [4]. For the pulse signal, a benchmark of 15 PPG beat detectors found that eight did well at rest in hospital and wearable data, while accuracy dropped in atrial fibrillation, in neonates and during exercise [10]. Pretraining has moved too: PaPaGei, an open PPG foundation model trained on about 57,000 hours of data, improved classification metrics by 6.3% and regression metrics by 2.9% in at least 14 of 20 tasks [11].</w:t>
       </w:r>
     </w:p>
     <w:p>
@@ -654,7 +654,7 @@
           <w:sz w:val="24"/>
           <w:szCs w:val="24"/>
         </w:rPr>
-        <w:t xml:space="preserve">Comparison of the key studies reviewed. Results are quoted from the cited sources; "not stated" means the abstract does not give a number.</w:t>
+        <w:t xml:space="preserve">Studies reviewed, with results as quoted from the sources. "Not stated" means the abstract gives no number.</w:t>
       </w:r>
     </w:p>
     <w:tbl>
@@ -1983,7 +1983,7 @@
           <w:sz w:val="28"/>
           <w:szCs w:val="28"/>
         </w:rPr>
-        <w:t xml:space="preserve">Taken together, the reviewed work leaves a practical question open. Whether numbers from different papers can be lined up depends on splits and validation details that the abstracts do not give. A fair comparison needs the same splits, the same parameter budget, a validation set separate from the test fold, and strong non-deep baselines next to the networks. The project addresses that gap: a leakage-audited comparison on two datasets, and a direct test of whether attention between ECG and pulse is doing what its design assumes.</w:t>
+        <w:t xml:space="preserve">The abstracts do not say enough to line these papers up against each other: splits, validation sets and parameter budgets are left out. A fair comparison would use the same splits, the same parameter budget, a validation set separate from the test fold, and strong non-deep baselines beside the networks. That is what we tried to build here, on two datasets. We also wanted to know whether attention between ECG and pulse does what its design assumes.</w:t>
       </w:r>
     </w:p>
     <w:p>
@@ -2014,7 +2014,7 @@
           <w:sz w:val="28"/>
           <w:szCs w:val="28"/>
         </w:rPr>
-        <w:t xml:space="preserve">Two labelled datasets carry the main experiments. Table 2 summarises all data sources, and the sub-sections give the details. The source pages were last checked on 14 October 2026.</w:t>
+        <w:t xml:space="preserve">Two labelled datasets carry the main experiments, and Table 2 lists every data source we used. We checked the source pages on 14 October 2026.</w:t>
       </w:r>
     </w:p>
     <w:p>
@@ -2039,7 +2039,7 @@
           <w:sz w:val="24"/>
           <w:szCs w:val="24"/>
         </w:rPr>
-        <w:t xml:space="preserve">Datasets and external resources.</w:t>
+        <w:t xml:space="preserve">Data sources used in the experiments.</w:t>
       </w:r>
     </w:p>
     <w:tbl>
@@ -2905,7 +2905,7 @@
           <w:sz w:val="28"/>
           <w:szCs w:val="28"/>
         </w:rPr>
-        <w:t xml:space="preserve">The training set has 750 five-minute ICU records at 250 Hz, each holding a bedside-monitor alarm that fires at the 300 s mark and an expert true or false label for one of five alarm types [7], [8]. Recordings were read with the WFDB tools from PhysioNet [16]. Of the 750 records, 627 have a PPG channel, 343 have arterial blood pressure (ABP) and all have a second ECG lead. The original PPG cohort keeps the 592 records with a usable PPG window, of which 37.7% are true alarms. A recovered cohort of 724 records (39.6% true) uses ABP as the pulse channel for 132 records without PPG and drops 26 records whose window is too short or nearly flat.</w:t>
+        <w:t xml:space="preserve">The Challenge 2015 training set has 750 five-minute ICU records at 250 Hz. Each holds one bedside-monitor alarm, which fires at the 300 s mark, with an expert's true or false label for one of five alarm types [7], [8]. We read the recordings with the WFDB tools from PhysioNet [16]. Of the 750 records, 627 have a PPG channel, 343 have arterial blood pressure (ABP) and every record has a second ECG lead. The original PPG cohort keeps the 592 records with a usable PPG window, and 37.7% of them are true alarms. For a recovered cohort we used ABP as the pulse channel in 132 records that have no PPG and dropped 26 records whose window is too short or nearly flat. That cohort has 724 records, 39.6% true.</w:t>
       </w:r>
     </w:p>
     <w:p>
@@ -3949,7 +3949,7 @@
           <w:sz w:val="28"/>
           <w:szCs w:val="28"/>
         </w:rPr>
-        <w:t xml:space="preserve">Quality control was simple and applied to each window on its own samples: windows that were too short, almost flat or clipped, or with a quality score below 0.05, were dropped, and the counts above say how many. Each Challenge 2015 record yields one window, so splitting by record and by window is the same thing. Duplicate detection across records was not performed beyond record identifiers. Class imbalance (about 38% true alarms in Challenge 2015 and 28% in VTaC) was handled in the loss function, not by resampling, because resampling can place copies of one patient on both sides of a split.</w:t>
+        <w:t xml:space="preserve">Quality control was crude. Each window was judged on its own samples, and windows that were too short, almost flat or clipped, or that scored below 0.05 on our quality measure, were dropped. The counts above say how many. Each Challenge 2015 record yields one window, so splitting by record and by window comes to the same thing. We did not look for duplicates across records beyond the record identifiers. Class imbalance (about 38% true alarms in Challenge 2015 and 28% in VTaC) is handled in the loss function and not by resampling, because resampling can put copies of one patient on both sides of a split.</w:t>
       </w:r>
     </w:p>
     <w:p>
@@ -4042,7 +4042,7 @@
           <w:sz w:val="28"/>
           <w:szCs w:val="28"/>
         </w:rPr>
-        <w:t xml:space="preserve">The project did not start from a finished design. It started from one hypothesis, that cross-attention between ECG and pulse would verify alarms better than simpler fusion, and then tried to break that hypothesis with fairer tests. A cross-attention network was built first, with three same-size relatives (ECG-only, PPG-only, concatenation) so any difference could be traced to the fusion step. Stronger rivals were added next: other fusion layers, other network families, feature-based learners and a better training recipe. The last stage perturbed the inputs to see what the networks actually use.</w:t>
+        <w:t xml:space="preserve">We did not start with a finished design. We started with one hypothesis, that cross-attention between ECG and pulse would verify alarms better than simpler fusion, and then spent most of the project trying to break it. The cross-attention network came first, with three relatives of the same size (ECG-only, PPG-only, concatenation) so that any difference could be traced to the fusion step. Next came the rivals: other fusion layers, other network families, feature-based learners and a stronger training recipe. The last stage was to perturb the inputs and see what the networks actually use.</w:t>
       </w:r>
     </w:p>
     <w:p>
@@ -4073,7 +4073,7 @@
           <wp:inline distT="0" distB="0" distL="0" distR="0">
             <wp:extent cx="5581650" cy="2686050"/>
             <wp:effectExtent t="0" r="0" b="0" l="0"/>
-            <wp:docPr id="1" name="workflow.png" descr="Workflow from problem definition to final evaluation. Splits are made by record before any model is fitted, and the outer test data are touched once." title="Figure 1"/>
+            <wp:docPr id="1" name="workflow.png" descr="Workflow of the project. Records are split before any model is fitted, and the outer test data are used once." title="Figure 1"/>
             <wp:cNvGraphicFramePr>
               <a:graphicFrameLocks xmlns:a="http://schemas.openxmlformats.org/drawingml/2006/main" noChangeAspect="1"/>
             </wp:cNvGraphicFramePr>
@@ -4130,7 +4130,7 @@
           <w:sz w:val="24"/>
           <w:szCs w:val="24"/>
         </w:rPr>
-        <w:t xml:space="preserve">Workflow from problem definition to final evaluation. Splits are made by record before any model is fitted, and the outer test data are touched once.</w:t>
+        <w:t xml:space="preserve">Workflow of the project. Records are split before any model is fitted, and the outer test data are used once.</w:t>
       </w:r>
     </w:p>
     <w:p>
@@ -4161,7 +4161,7 @@
           <w:sz w:val="28"/>
           <w:szCs w:val="28"/>
         </w:rPr>
-        <w:t xml:space="preserve">Only these steps were applied. Signals were resampled to 250 Hz, then band-pass filtered with a zero-phase fourth-order Butterworth filter (ECG 0.5 to 40 Hz, pulse 0.5 to 8 Hz). Each 10 s window was z-normalised on its own samples, which removes absolute amplitude differences caused by gain and placement. The window is aligned to end at the alarm onset. An earlier version centred the window on the alarm, which let the model see samples after it; that was corrected, and the 30 s after the alarm are now used only in a separate time-to-verdict analysis. For the classical models, 266 features were computed per window and imputed, clipped and standardised using statistics from the fitting data of each fold only.</w:t>
+        <w:t xml:space="preserve">Signals were resampled to 250 Hz, then band-pass filtered with a zero-phase fourth-order Butterworth filter (ECG 0.5 to 40 Hz, pulse 0.5 to 8 Hz). Each 10 s window was z-normalised on its own samples, which removes absolute amplitude differences caused by gain and placement. The window is aligned to end at the alarm onset. An earlier version centred the window on the alarm, which let the model see samples after it; that was corrected, and the 30 s after the alarm are now used only in a separate time-to-verdict analysis. For the classical models, 266 features were computed per window and imputed, clipped and standardised using statistics from the fitting data of each fold only.</w:t>
       </w:r>
     </w:p>
     <w:p>
@@ -4192,7 +4192,7 @@
           <w:sz w:val="28"/>
           <w:szCs w:val="28"/>
         </w:rPr>
-        <w:t xml:space="preserve">Cross-attention was chosen first because the project hypothesis was about alignment between two signals. Its comparators are the ladder variants, built to about 261k parameters each by scaling channel widths, so a gap between them is not a capacity effect. The wider set covers four other fusion layers (bidirectional cross-attention, joint transformer, bottleneck tokens, quality-gated cross-attention) and six early-fusion families: ResNet1D [17], InceptionTime [18], a bidirectional GRU, a temporal convolutional network (TCN) [19], a patch transformer and a small state-space model. That makes 14 neural architectures. Classical learners (logistic regression, RBF-SVM, random forest, extra trees, XGBoost [20] and an MLP) were run on engineered features, with a Pan-Tompkins-style beat detector [21] behind the timing features, because the feature route is the obvious non-deep alternative and was likely to be strong with only a few hundred records.</w:t>
+        <w:t xml:space="preserve">We built cross-attention first because the project hypothesis was about alignment between two signals. The ladder variants were scaled to about 261k parameters each, by adjusting channel widths, so a gap between them cannot be blamed on capacity. The wider comparison covers four other fusion layers (bidirectional cross-attention, joint transformer, bottleneck tokens, quality-gated cross-attention) and six early-fusion families: ResNet1D [17], InceptionTime [18], a bidirectional GRU, a temporal convolutional network (TCN) [19], a patch transformer and a small state-space model. Together with the four ladder variants that is 14 neural architectures. Classical learners (logistic regression, RBF-SVM, random forest, extra trees, XGBoost [20] and an MLP) ran on engineered features, with a Pan-Tompkins-style beat detector [21] behind the timing features. We expected the feature route to be strong with only a few hundred records.</w:t>
       </w:r>
     </w:p>
     <w:p>
@@ -4237,7 +4237,7 @@
           <w:sz w:val="28"/>
           <w:szCs w:val="28"/>
         </w:rPr>
-        <w:t xml:space="preserve">All code is Python 3. Models use PyTorch [22]; classical models and metrics use scikit-learn [23] and XGBoost; signal processing uses SciPy, PyWavelets and pandas. Experiments ran on one workstation with an RTX PRO 4000 Blackwell GPU (24 GB) and 20 CPU cores. A single cross-attention fold trains in about 5 s on average, one recipe fold (three members) in about 21 s on Challenge 2015 and 45 s on VTaC. The repository, listed in Annexure A, holds the code, configuration files and every result file used in this report.</w:t>
+        <w:t xml:space="preserve">Everything is Python 3. The models use PyTorch [22]; the classical models and metrics use scikit-learn [23] and XGBoost; signal processing uses SciPy, PyWavelets and pandas. We ran the experiments on one workstation with an RTX PRO 4000 Blackwell GPU (24 GB) and 20 CPU cores. The GPU was shared, which is why the recipe uses epoch caps and short patience. A cross-attention fold trains in about 5 s on average, a recipe fold (three members) in about 21 s on Challenge 2015 and 45 s on VTaC. Annexure A lists the repository, which holds the code, configuration files and every result file used here.</w:t>
       </w:r>
     </w:p>
     <w:p>
@@ -4285,7 +4285,7 @@
           <w:sz w:val="28"/>
           <w:szCs w:val="28"/>
         </w:rPr>
-        <w:t xml:space="preserve">Each signal goes through its own one-dimensional CNN, with separate weights because ECG and pulse look and fail so differently. The encoders keep the time axis instead of pooling it away, since attention needs a sequence to compare. ECG positions act as queries over the pulse positions, which supply keys and values, and the fused sequence is averaged over time before a small classification head.</w:t>
+        <w:t xml:space="preserve">The proposed model gives each signal its own one-dimensional CNN. The weights are not shared, because ECG and pulse look and fail so differently. The encoders do not pool the time axis away, since attention needs a sequence to compare. ECG positions act as queries over the pulse positions, which supply the keys and values, and the fused sequence is averaged over time before a small classification head.</w:t>
       </w:r>
     </w:p>
     <w:p>
@@ -4299,7 +4299,7 @@
           <wp:inline distT="0" distB="0" distL="0" distR="0">
             <wp:extent cx="5667375" cy="3143250"/>
             <wp:effectExtent t="0" r="0" b="0" l="0"/>
-            <wp:docPr id="1" name="arch_ladder.png" descr="Architecture of the cross-attention fusion network. Shapes are (time steps x channels). The two encoders do not share weights." title="Figure 2"/>
+            <wp:docPr id="1" name="arch_ladder.png" descr="Cross-attention fusion network. Shapes are (time steps x channels), and the two encoders have separate weights." title="Figure 2"/>
             <wp:cNvGraphicFramePr>
               <a:graphicFrameLocks xmlns:a="http://schemas.openxmlformats.org/drawingml/2006/main" noChangeAspect="1"/>
             </wp:cNvGraphicFramePr>
@@ -4356,7 +4356,7 @@
           <w:sz w:val="24"/>
           <w:szCs w:val="24"/>
         </w:rPr>
-        <w:t xml:space="preserve">Architecture of the cross-attention fusion network. Shapes are (time steps x channels). The two encoders do not share weights.</w:t>
+        <w:t xml:space="preserve">Cross-attention fusion network. Shapes are (time steps x channels), and the two encoders have separate weights.</w:t>
       </w:r>
     </w:p>
     <w:p>
@@ -6519,7 +6519,7 @@
           <w:sz w:val="28"/>
           <w:szCs w:val="28"/>
         </w:rPr>
-        <w:t xml:space="preserve">The final logit z is turned into the probability that the alarm is true by the sigmoid function, and a decision threshold of 0.5 gives the class labels reported in Section 7.</w:t>
+        <w:t xml:space="preserve">The last layer outputs a logit z, and the sigmoid below converts it to the probability that the alarm is true. Section 7 uses a threshold of 0.5 for the class labels.</w:t>
       </w:r>
     </w:p>
     <w:p>
@@ -6604,7 +6604,7 @@
           <w:sz w:val="28"/>
           <w:szCs w:val="28"/>
         </w:rPr>
-        <w:t xml:space="preserve">Let E and P be the ECG and PPG feature sequences after the linear projection and positional encoding, each of shape (T' x d). With learned matrices W_Q, W_K and W_V, the attention output is</w:t>
+        <w:t xml:space="preserve">E and P are the ECG and PPG feature sequences after the linear projection and positional encoding, each of shape (T' x d), and W_Q, W_K and W_V are learned matrices. The attention output is</w:t>
       </w:r>
     </w:p>
     <w:p>
@@ -6672,7 +6672,7 @@
           <w:sz w:val="28"/>
           <w:szCs w:val="28"/>
         </w:rPr>
-        <w:t xml:space="preserve">where d_k is the key dimension (128 divided by the 4 heads). Row i of the softmax gives the weights with which ECG step i reads the pulse steps. If the network really tracked the pulse transit time, these weights would peak at a lag matching the physiological delay; Section 8 shows that they do not.</w:t>
+        <w:t xml:space="preserve">Here d_k is the key dimension, 128 divided by the 4 heads. Row i of the softmax holds the weights with which ECG step i reads the pulse steps. A network that tracked pulse transit time would put these weights at a lag matching the physiological delay. Ours did not (Section 8).</w:t>
       </w:r>
     </w:p>
     <w:p>
@@ -6703,7 +6703,7 @@
           <w:sz w:val="28"/>
           <w:szCs w:val="28"/>
         </w:rPr>
-        <w:t xml:space="preserve">The recipe uses a gated recurrent unit with update gate z_t, reset gate r_t and candidate state h~_t:</w:t>
+        <w:t xml:space="preserve">The recurrent layer in the recipe is a gated recurrent unit, with update gate z_t, reset gate r_t and candidate state h~_t:</w:t>
       </w:r>
     </w:p>
     <w:p>
@@ -6825,7 +6825,7 @@
           <w:sz w:val="28"/>
           <w:szCs w:val="28"/>
         </w:rPr>
-        <w:t xml:space="preserve">Here sigma is the sigmoid, the circled dot is element-wise multiplication, and W, U and b are learned. Running the GRU forwards and backwards over the 39 steps gives states h_t of size 164, which additive attention pools into one context vector c:</w:t>
+        <w:t xml:space="preserve">Sigma is the sigmoid, the circled dot is element-wise multiplication, and W, U and b are learned. The GRU runs forwards and backwards over the 39 steps, giving states h_t of size 164, and additive attention pools them into one context vector c:</w:t>
       </w:r>
     </w:p>
     <w:p>
@@ -6910,7 +6910,7 @@
           <w:sz w:val="28"/>
           <w:szCs w:val="28"/>
         </w:rPr>
-        <w:t xml:space="preserve">Both model families are trained with a focal loss [24], a weighted binary cross-entropy that multiplies each example by (1 minus p_t) raised to a power gamma, with gamma = 2. Here p_t is the probability the model gives to the correct class and w is a positive-class weight for the imbalance:</w:t>
+        <w:t xml:space="preserve">Both model families train with a focal loss [24]. It is a weighted binary cross-entropy in which each example is multiplied by (1 minus p_t) raised to a power gamma, with gamma = 2. Here p_t is the probability the model gives to the correct class, and w is a positive-class weight for the imbalance:</w:t>
       </w:r>
     </w:p>
     <w:p>
@@ -6978,7 +6978,7 @@
           <w:sz w:val="28"/>
           <w:szCs w:val="28"/>
         </w:rPr>
-        <w:t xml:space="preserve">Well-classified examples (p_t near 1) are down-weighted, so training concentrates on the hard ones, which suits a task where most alarms are easy and the rare true alarms matter most. In the recipe grid, a binary cross-entropy with label smoothing of 0.05 was tested as the alternative.</w:t>
+        <w:t xml:space="preserve">Examples the model already gets right (p_t near 1) count for little, so training spends its effort on the hard ones. Most alarms are easy and the rare true alarms matter most, which is why we chose it. The recipe grid also tried binary cross-entropy with label smoothing of 0.05.</w:t>
       </w:r>
     </w:p>
     <w:p>
@@ -6995,7 +6995,7 @@
           <w:sz w:val="28"/>
           <w:szCs w:val="28"/>
         </w:rPr>
-        <w:t xml:space="preserve">6.5 Optimisers and weight averaging</w:t>
+        <w:t xml:space="preserve">6.5 Optimiser and weight averaging</w:t>
       </w:r>
     </w:p>
     <w:p>
@@ -7009,7 +7009,7 @@
           <w:sz w:val="28"/>
           <w:szCs w:val="28"/>
         </w:rPr>
-        <w:t xml:space="preserve">The baseline ladder uses Adam. The recipe uses AdamW [25], which applies weight decay lambda directly to the weights instead of through the gradient, with a one-cycle learning-rate schedule [26] (15% warm-up, then cosine decay). With gradient g_t, moment decays beta_1 and beta_2, and bias-corrected moments, one step is</w:t>
+        <w:t xml:space="preserve">The baseline ladder trains with Adam. The recipe uses AdamW [25], which applies weight decay lambda directly to the weights and not through the gradient, together with a one-cycle learning-rate schedule [26] (15% warm-up, then cosine decay). With gradient g_t, moment decays beta_1 and beta_2 and bias-corrected moments, one step is</w:t>
       </w:r>
     </w:p>
     <w:p>
@@ -7210,7 +7210,7 @@
           <w:sz w:val="28"/>
           <w:szCs w:val="28"/>
         </w:rPr>
-        <w:t xml:space="preserve">All experiments ran on the workstation described in Section 4.5. For Challenge 2015 each seed gives five folds with about 402 fitting, 71 inner-validation and 119 test records; seeds 0 to 9 vary the fold assignment and the initialisation (50 test evaluations per model). For VTaC the official split gives 3,662 training, 453 validation and 427 test events (120 true alarms), and seeds 0 to 4 vary the initialisation (10 seeds for the two single-signal models). The recipe grid used seeds 100 to 102 on the Challenge 2015 PPG cohort and never produced test predictions. The configuration file sets a global seed of 42. Every model sees the identical splits, so comparisons are paired.</w:t>
+        <w:t xml:space="preserve">All experiments ran on the workstation described in Section 4.5. For Challenge 2015 each seed gives five folds with about 402 fitting, 71 inner-validation and 119 test records; seeds 0 to 9 vary the fold assignment and the initialisation (50 test evaluations per model). For VTaC the official split gives 3,662 training, 453 validation and 427 test events (120 true alarms), and seeds 0 to 4 vary the initialisation (10 seeds for the two single-signal models). The recipe grid used seeds 100 to 102 on the Challenge 2015 PPG cohort and never produced test predictions. The configuration file sets a global seed of 42. All models run on the same splits, which makes the comparisons paired.</w:t>
       </w:r>
     </w:p>
     <w:p>
@@ -8486,7 +8486,7 @@
           <w:sz w:val="28"/>
           <w:szCs w:val="28"/>
         </w:rPr>
-        <w:t xml:space="preserve">Because the task is binary, the headline F1 is the F1 of the true-alarm class at a threshold of 0.5. In the class-wise reports below, macro averages take the unweighted mean of the two classes and weighted averages weight each class by its support. The PhysioNet Challenge score, which counts a missed true alarm as five false alarms [7], is</w:t>
+        <w:t xml:space="preserve">We also report the PhysioNet Challenge score [7], in which one missed true alarm costs as much as five false alarms:</w:t>
       </w:r>
     </w:p>
     <w:p>
@@ -8554,7 +8554,7 @@
           <w:sz w:val="28"/>
           <w:szCs w:val="28"/>
         </w:rPr>
-        <w:t xml:space="preserve">Model differences are tested with a paired record-level bootstrap with 5,000 resamples [27] and with the Nadeau-Bengio corrected resampled t-test [28], with Holm correction [29] over a comparison family listed in the configuration file before the final runs. A difference is called robust only when both tests agree.</w:t>
+        <w:t xml:space="preserve">To compare models we used a paired record-level bootstrap with 5,000 resamples [27], the Nadeau-Bengio corrected resampled t-test [28] and Holm correction [29]. The comparison family was written into the configuration file before the final runs. A difference counts as robust only when both tests agree.</w:t>
       </w:r>
     </w:p>
     <w:p>
@@ -13228,7 +13228,7 @@
           <wp:inline distT="0" distB="0" distL="0" distR="0">
             <wp:extent cx="5667375" cy="2476500"/>
             <wp:effectExtent t="0" r="0" b="0" l="0"/>
-            <wp:docPr id="1" name="leaderboard.png" descr="F1 of the compared models on Challenge 2015 (left) and VTaC (right), threshold 0.5. The originally proposed cross-attention model (red) is near the bottom on both." title="Figure 4"/>
+            <wp:docPr id="1" name="leaderboard.png" descr="F1 of the compared models on Challenge 2015 (left) and VTaC (right), threshold 0.5. The originally proposed cross-attention model (black) is near the bottom on both." title="Figure 4"/>
             <wp:cNvGraphicFramePr>
               <a:graphicFrameLocks xmlns:a="http://schemas.openxmlformats.org/drawingml/2006/main" noChangeAspect="1"/>
             </wp:cNvGraphicFramePr>
@@ -13285,7 +13285,7 @@
           <w:sz w:val="24"/>
           <w:szCs w:val="24"/>
         </w:rPr>
-        <w:t xml:space="preserve">F1 of the compared models on Challenge 2015 (left) and VTaC (right), threshold 0.5. The originally proposed cross-attention model (red) is near the bottom on both.</w:t>
+        <w:t xml:space="preserve">F1 of the compared models on Challenge 2015 (left) and VTaC (right), threshold 0.5. The originally proposed cross-attention model (black) is near the bottom on both.</w:t>
       </w:r>
     </w:p>
     <w:p>
@@ -16136,7 +16136,7 @@
           <wp:inline distT="0" distB="0" distL="0" distR="0">
             <wp:extent cx="5486400" cy="2790825"/>
             <wp:effectExtent t="0" r="0" b="0" l="0"/>
-            <wp:docPr id="1" name="../../runs/challenge2015_ppg/error_taxonomy/figures/case_FN_cross_attention_1_v597l.png" descr="A missed true alarm (false negative). Record v597l is a true ventricular tachycardia alarm. The cross-attention model gives it a true-alarm probability of 0.24, and the gradient-boosting and ResNet1D models also miss it (0.21 and 0.37). The heuristic note says the PPG looks non-periodic and the beat detectors disagree (ECG 78 bpm, PPG 119 bpm)." title="Figure 8"/>
+            <wp:docPr id="1" name="../../runs/challenge2015_ppg/error_taxonomy/figures/case_FN_cross_attention_1_v597l.png" descr="A missed true alarm (false negative). Record v597l is a true ventricular tachycardia alarm. The cross-attention model gives it a true-alarm probability of 0.24, and the gradient-boosting and ResNet1D models also miss it (0.21 and 0.37). The automatic note under the plot calls the PPG non-periodic and says the two beat detectors disagree (ECG 78 bpm, PPG 119 bpm)." title="Figure 8"/>
             <wp:cNvGraphicFramePr>
               <a:graphicFrameLocks xmlns:a="http://schemas.openxmlformats.org/drawingml/2006/main" noChangeAspect="1"/>
             </wp:cNvGraphicFramePr>
@@ -16193,7 +16193,7 @@
           <w:sz w:val="24"/>
           <w:szCs w:val="24"/>
         </w:rPr>
-        <w:t xml:space="preserve">A missed true alarm (false negative). Record v597l is a true ventricular tachycardia alarm. The cross-attention model gives it a true-alarm probability of 0.24, and the gradient-boosting and ResNet1D models also miss it (0.21 and 0.37). The heuristic note says the PPG looks non-periodic and the beat detectors disagree (ECG 78 bpm, PPG 119 bpm).</w:t>
+        <w:t xml:space="preserve">A missed true alarm (false negative). Record v597l is a true ventricular tachycardia alarm. The cross-attention model gives it a true-alarm probability of 0.24, and the gradient-boosting and ResNet1D models also miss it (0.21 and 0.37). The automatic note under the plot calls the PPG non-periodic and says the two beat detectors disagree (ECG 78 bpm, PPG 119 bpm).</w:t>
       </w:r>
     </w:p>
     <w:p>
@@ -16337,7 +16337,7 @@
           <w:sz w:val="28"/>
           <w:szCs w:val="28"/>
         </w:rPr>
-        <w:t xml:space="preserve">The confusion matrices show where the errors sit. On VTaC the recipe misses 8 of 120 true alarms per seed on average (recall 0.933) and raises about 29 false positives among 307 false alarms (specificity 0.905); cross-attention misses about 22 true alarms and raises 44 false ones. On Challenge 2015 the recipe misses about 39 of 223 true alarms, against 60 for cross-attention. The per-type breakdown of cross-attention explains part of this. Tachycardia has an F1 of 0.92 but a specificity of only 0.42, because 106 of its 111 alarms are true and the model rarely says no; VT has an F1 of 0.49; asystole (14 true alarms) and flutter/fibrillation (5) are too small to judge. In the error analysis, VT dominates the persistent misses (18 of 29 for the gradient-boosting model, although VT is 26% of true alarms).</w:t>
+        <w:t xml:space="preserve">The confusion matrices show where the errors sit. On VTaC the recipe misses 8 of 120 true alarms per seed on average (recall 0.933) and raises about 29 false positives among 307 false alarms (specificity 0.905); cross-attention misses about 22 true alarms and raises 44 false ones. On Challenge 2015 the recipe misses about 39 of 223 true alarms, against 60 for cross-attention. Part of this comes from alarm type. Cross-attention scores F1 0.92 on tachycardia, but its specificity there is only 0.42: 106 of the 111 tachycardia alarms are true, and the model rarely says no. VT gets an F1 of 0.49. Asystole (14 true alarms) and flutter/fibrillation (5) are too small to judge. In the error analysis VT also dominates the persistent misses, 18 of 29 for the gradient-boosting model, although VT makes up only 26% of true alarms.</w:t>
       </w:r>
     </w:p>
     <w:p>
@@ -16351,7 +16351,7 @@
           <w:sz w:val="28"/>
           <w:szCs w:val="28"/>
         </w:rPr>
-        <w:t xml:space="preserve">Overfitting is hard to read without training curves, so only indirect evidence is available. For the recipe, the mean inner-validation AUC of the chosen members was 0.931 on Challenge 2015 and 0.965 on VTaC, against test AUCs of 0.932 and 0.966, so there is no large validation-to-test gap. The validation numbers are maxima over epochs and therefore slightly optimistic, and a member is compared here with an ensemble, so this is a consistency check and not proof. For the ladder models the evidence points the other way: their test scores are modest and the validation sets are small, so we cannot separate underfitting from a weak use of the second signal. Fifteen to twenty-five true alarms per Challenge 2015 validation set also make epoch selection noisy.</w:t>
+        <w:t xml:space="preserve">Without training curves, overfitting can only be judged indirectly. For the recipe, the chosen members had a mean inner-validation AUC of 0.931 on Challenge 2015 and 0.965 on VTaC, and the test AUCs were 0.932 and 0.966, so we see no large validation-to-test gap. That check is soft. Validation numbers are maxima over epochs and so slightly optimistic, and we are comparing single members with an ensemble. For the ladder models the picture is murkier: test scores are modest and validation sets are small, so we cannot separate underfitting from a weak use of the second signal. A Challenge 2015 validation set holds only 15 to 25 true alarms, which makes epoch selection noisy.</w:t>
       </w:r>
     </w:p>
     <w:p>
@@ -16365,7 +16365,7 @@
           <w:sz w:val="28"/>
           <w:szCs w:val="28"/>
         </w:rPr>
-        <w:t xml:space="preserve">The comparison is fair on splits, seeds and parameter count, but not on training. The ladder variants use Adam, F1-based early stopping and a batch of 16, while the recipe uses augmentation, AdamW, weight averaging and ensembling. The ablation shows how much that matters: removing weight averaging costs 0.008 F1, a single member with raw weights and no test-time augmentation loses 0.035, and ensembling three members instead of one adds about 0.012. Part of the gap between the recipe and the baseline CNNs is therefore the trainer and not the architecture. A shuffled-label control on one fold gave an AUC of 0.57, which is chance level, and the split check confirmed that fitting, validation and test records were disjoint, so no leakage was found. The recipe configuration was selected on inner-validation scores from Challenge 2015 folds whose records are test records in other seeds, so a small optimistic bias is possible on that dataset. The VTaC result, where the same recipe was applied without re-tuning, is the cleaner check.</w:t>
+        <w:t xml:space="preserve">The comparison is fair on splits, seeds and parameter count, and unfair on training. The ladder variants use Adam, F1-based early stopping and a batch of 16. The recipe adds augmentation, AdamW, weight averaging and ensembling. The ablation shows what that is worth: dropping weight averaging costs 0.008 F1, a single member with raw weights and no test-time augmentation loses 0.035, and going from one member to three adds about 0.012. So part of the gap between the recipe and the baseline CNNs belongs to the trainer, not the architecture. We looked for leakage in the recipe and found none: a shuffled-label control on one fold gave an AUC of 0.57, which is chance, and a split check confirmed that fitting, validation and test records were disjoint. One bias remains. We chose the recipe configuration on inner-validation scores from Challenge 2015 folds, and those records are test records in other seeds, so the numbers for that dataset may be slightly optimistic. The VTaC result, where the same recipe ran without re-tuning, is the cleaner check.</w:t>
       </w:r>
     </w:p>
     <w:p>
@@ -16393,7 +16393,7 @@
           <w:sz w:val="28"/>
           <w:szCs w:val="28"/>
         </w:rPr>
-        <w:t xml:space="preserve">Robustness tells a similar story. With real noise on the ECG and synthetic motion on the PPG at 0 dB signal-to-noise ratio, ResNet1D held its AUC at 0.844 (0.907 when clean), while cross-attention fell from 0.856 to 0.696 and concatenation from 0.833 to 0.720. Zeroing the PPG at test time cost cross-attention 0.12 AUC and ResNet1D 0.27. Transfer between datasets is lopsided: models trained on Challenge 2015 scored F1 of only 0.56 to 0.60 on VTaC when they used the ECG (PPG-only was near chance at 0.432), but models trained on VTaC reached F1 0.773 and AUC 0.927 on the VT alarms of Challenge 2015 with ResNet1D. More data helped more than a cleverer model, and numbers from a single dataset overstate what a model would do elsewhere.</w:t>
+        <w:t xml:space="preserve">The noise tests point the same way. We added real Noise Stress Test noise to the ECG and synthetic motion artefact to the PPG. At 0 dB signal-to-noise ratio on both, ResNet1D held its AUC at 0.844 (0.907 clean), while cross-attention fell from 0.856 to 0.696 and concatenation from 0.833 to 0.720. Zeroing the PPG at test time cost cross-attention 0.12 AUC and ResNet1D 0.27. Transfer between datasets is lopsided. Models trained on Challenge 2015 scored an F1 of only 0.56 to 0.60 on VTaC when they used the ECG (PPG-only was near chance at 0.432). Models trained on VTaC did well on the VT alarms of Challenge 2015: ResNet1D reached F1 0.773 and AUC 0.927. More data helped more than a cleverer model, and numbers from one dataset overstate what a model would do elsewhere.</w:t>
       </w:r>
     </w:p>
     <w:p>
@@ -16452,7 +16452,7 @@
           <w:sz w:val="28"/>
           <w:szCs w:val="28"/>
         </w:rPr>
-        <w:t xml:space="preserve">The main contribution is the evidence behind that result: matched-size comparisons, paired statistics, counterfactual tests showing that the networks use signal content and not ECG-to-pulse timing, and an explicit record of the leak that had inflated the first numbers by 0.075 F1. The principal limitations are small datasets, no prospective validation, weak transfer from Challenge 2015 to VTaC and training curves that were not archived.</w:t>
+        <w:t xml:space="preserve">What the project contributes is the evidence behind that result: matched-size comparisons, paired statistics, counterfactual tests showing that the networks use signal content and not ECG-to-pulse timing, and an explicit record of the leak that had inflated our first numbers by 0.075 F1. The weak points are the small datasets, the lack of prospective validation, the poor transfer from Challenge 2015 to VTaC, and the training curves we did not save.</w:t>
       </w:r>
     </w:p>
     <w:p>
@@ -20316,7 +20316,49 @@
           <w:sz w:val="28"/>
           <w:szCs w:val="28"/>
         </w:rPr>
-        <w:t xml:space="preserve">AF screening on MIMIC PERform AF (35 subjects, subject-wise cross-validation, low power): a gradient-boosting model on RR-irregularity features reached subject-level AUC 1.00, significantly better than the best neural model (0.93); fusion beat a PPG-only network by +0.28 subject AUC; distilling a PPG-only student from the fusion teacher gave no benefit. Foundation model: a frozen PaPaGei linear probe reached F1 0.58 on Challenge 2015, and the best PaPaGei fusion model was about 0.04 F1 below scratch cross-attention [11]. Label reliability: 7.7% of VTaC events have split annotator votes, and accuracy on them is much lower (cross-attention 0.704 against 0.854 on unanimous events). Safety layer, concatenation model: a 10% miss tolerance at 90% confidence could be certified in 42 of 50 folds, suppressing 22.5% of false alarms while missing 2.9% of true alarms, with calibration reducing the expected calibration error from 0.167 to 0.121 (temperature scaling [30], exact Clopper-Pearson bound [31]).</w:t>
+        <w:t xml:space="preserve">AF screening (MIMIC PERform AF, 35 subjects, subject-wise cross-validation, low power). A gradient-boosting model on RR-irregularity features reached subject-level AUC 1.00, significantly better than the best neural model at 0.93. Fusion beat a PPG-only network by +0.28 subject AUC, and distilling a PPG-only student from the fusion teacher gave no benefit.</w:t>
+      </w:r>
+    </w:p>
+    <w:p>
+      <w:pPr>
+        <w:spacing w:after="120" w:line="276"/>
+        <w:jc w:val="both"/>
+      </w:pPr>
+      <w:r>
+        <w:rPr>
+          <w:rFonts w:ascii="Times New Roman" w:cs="Times New Roman" w:eastAsia="Times New Roman" w:hAnsi="Times New Roman"/>
+          <w:sz w:val="28"/>
+          <w:szCs w:val="28"/>
+        </w:rPr>
+        <w:t xml:space="preserve">Foundation model. A frozen PaPaGei linear probe reached F1 0.58 on Challenge 2015, and the best PaPaGei fusion model was about 0.04 F1 below scratch cross-attention [11].</w:t>
+      </w:r>
+    </w:p>
+    <w:p>
+      <w:pPr>
+        <w:spacing w:after="120" w:line="276"/>
+        <w:jc w:val="both"/>
+      </w:pPr>
+      <w:r>
+        <w:rPr>
+          <w:rFonts w:ascii="Times New Roman" w:cs="Times New Roman" w:eastAsia="Times New Roman" w:hAnsi="Times New Roman"/>
+          <w:sz w:val="28"/>
+          <w:szCs w:val="28"/>
+        </w:rPr>
+        <w:t xml:space="preserve">Label reliability. In VTaC, 7.7% of events have split annotator votes, and the models do much worse on them: cross-attention scores 0.704 accuracy there against 0.854 on unanimous events.</w:t>
+      </w:r>
+    </w:p>
+    <w:p>
+      <w:pPr>
+        <w:spacing w:after="120" w:line="276"/>
+        <w:jc w:val="both"/>
+      </w:pPr>
+      <w:r>
+        <w:rPr>
+          <w:rFonts w:ascii="Times New Roman" w:cs="Times New Roman" w:eastAsia="Times New Roman" w:hAnsi="Times New Roman"/>
+          <w:sz w:val="28"/>
+          <w:szCs w:val="28"/>
+        </w:rPr>
+        <w:t xml:space="preserve">Safety layer (concatenation model only). With a 10% miss tolerance at 90% confidence, a threshold could be certified in 42 of 50 folds. In those folds the layer suppressed 22.5% of false alarms and missed 2.9% of true alarms, and calibration lowered the expected calibration error from 0.167 to 0.121 (temperature scaling [30], exact Clopper-Pearson bound [31]).</w:t>
       </w:r>
     </w:p>
     <w:p>
@@ -20347,7 +20389,7 @@
           <w:sz w:val="28"/>
           <w:szCs w:val="28"/>
         </w:rPr>
-        <w:t xml:space="preserve">No end-user application was built. The project includes a static results dashboard (site/index.html) and a replay page (site/replay.html) that display the stored leaderboards. The screenshot below shows the dashboard header and the Challenge 2015 leaderboard. One caveat: the dashboard labels the best VTaC model "attn CNN-RNN + features", but the recipe code only uses the hand-crafted features for the "_feat" architectures, and the winning architecture is the plain attention CNN-GRU without them, which is also consistent with its parameter count (258,857).</w:t>
+        <w:t xml:space="preserve">We did not build an end-user application. The project includes a static results dashboard (site/index.html) and a replay page (site/replay.html) that display the stored leaderboards. The screenshot below shows the dashboard header and the Challenge 2015 leaderboard. One caveat: the dashboard labels the best VTaC model "attn CNN-RNN + features", but the recipe code only uses the hand-crafted features for the "_feat" architectures, and the winning architecture is the plain attention CNN-GRU without them, which is also consistent with its parameter count (258,857).</w:t>
       </w:r>
     </w:p>
     <w:p>

</xml_diff>